<commit_message>
✨ feat: create e2e test 'should search & update an existing document'
</commit_message>
<xml_diff>
--- a/apps/web/templates/NomadDocs/Lease Agreement.docx
+++ b/apps/web/templates/NomadDocs/Lease Agreement.docx
@@ -386,12 +386,14 @@
     <w:p>
       <w:pPr>
         <w:pBdr/>
-        <w:spacing w:after="170" w:line="281" w:lineRule="auto"/>
-        <w:ind w:right="240" w:left="40"/>
-        <w:jc w:val="both"/>
+        <w:spacing/>
+        <w:ind w:right="322"/>
         <w:rPr>
           <w:rFonts w:ascii="Times New Roman" w:hAnsi="Times New Roman" w:eastAsia="Times New Roman" w:cs="Times New Roman"/>
-          <w:color w:val="000000"/>
+          <w:b/>
+          <w:bCs/>
+          <w:sz w:val="20"/>
+          <w:szCs w:val="20"/>
         </w:rPr>
       </w:pPr>
       <w:r>
@@ -550,18 +552,75 @@
       </w:r>
       <w:r>
         <w:rPr>
-          <w:rFonts w:ascii="Times New Roman" w:hAnsi="Times New Roman" w:eastAsia="Times New Roman" w:cs="Times New Roman"/>
-          <w:color w:val="000000"/>
+          <w:rFonts w:hint="default" w:ascii="Times New Roman" w:hAnsi="Times New Roman"/>
+          <w:b w:val="0"/>
+          <w:bCs w:val="0"/>
+          <w:sz w:val="24"/>
+          <w:szCs w:val="24"/>
           <w:lang w:val="en-US"/>
         </w:rPr>
-        <w:t xml:space="preserve">{organization.organization}</w:t>
+        <w:t xml:space="preserve">{customer.</w:t>
+      </w:r>
+      <w:r>
+        <w:rPr>
+          <w:rFonts w:hint="default" w:ascii="Times New Roman" w:hAnsi="Times New Roman"/>
+          <w:b w:val="0"/>
+          <w:bCs w:val="0"/>
+          <w:sz w:val="24"/>
+          <w:szCs w:val="24"/>
+          <w:lang w:val="en-US"/>
+        </w:rPr>
+        <w:t xml:space="preserve">organization</w:t>
+      </w:r>
+      <w:r>
+        <w:rPr>
+          <w:rFonts w:hint="default" w:ascii="Times New Roman" w:hAnsi="Times New Roman"/>
+          <w:b w:val="0"/>
+          <w:bCs w:val="0"/>
+          <w:sz w:val="24"/>
+          <w:szCs w:val="24"/>
+          <w:lang w:val="en-US"/>
+        </w:rPr>
+        <w:t xml:space="preserve">.</w:t>
+      </w:r>
+      <w:r>
+        <w:rPr>
+          <w:rFonts w:hint="default" w:ascii="Times New Roman" w:hAnsi="Times New Roman"/>
+          <w:b w:val="0"/>
+          <w:bCs w:val="0"/>
+          <w:sz w:val="24"/>
+          <w:szCs w:val="24"/>
+          <w:lang w:val="en-US"/>
+        </w:rPr>
+        <w:t xml:space="preserve">organization</w:t>
+      </w:r>
+      <w:r>
+        <w:rPr>
+          <w:rFonts w:hint="default" w:ascii="Times New Roman" w:hAnsi="Times New Roman"/>
+          <w:b w:val="0"/>
+          <w:bCs w:val="0"/>
+          <w:sz w:val="24"/>
+          <w:szCs w:val="24"/>
+          <w:lang w:val="en-US"/>
+        </w:rPr>
+        <w:t xml:space="preserve">}</w:t>
+      </w:r>
+      <w:r>
+        <w:rPr>
+          <w:rFonts w:hint="default" w:ascii="Times New Roman" w:hAnsi="Times New Roman"/>
+          <w:b/>
+          <w:sz w:val="20"/>
+          <w:szCs w:val="20"/>
+          <w:lang w:val="en-US"/>
+        </w:rPr>
+        <w:t xml:space="preserve"> </w:t>
       </w:r>
       <w:r>
         <w:rPr>
           <w:rFonts w:ascii="Times New Roman" w:hAnsi="Times New Roman" w:eastAsia="Times New Roman" w:cs="Times New Roman"/>
           <w:color w:val="000000"/>
         </w:rPr>
-        <w:t xml:space="preserve"> в лице </w:t>
+        <w:t xml:space="preserve">в лице </w:t>
       </w:r>
       <w:r>
         <w:rPr>
@@ -660,16 +719,14 @@
         </w:rPr>
         <w:t xml:space="preserve">ендатор», с другой стороны заключили настоящий договор о нижеследующем:</w:t>
       </w:r>
+      <w:r/>
       <w:r>
         <w:rPr>
           <w:rFonts w:ascii="Times New Roman" w:hAnsi="Times New Roman" w:eastAsia="Times New Roman" w:cs="Times New Roman"/>
-          <w:color w:val="000000"/>
-        </w:rPr>
-      </w:r>
-      <w:r>
-        <w:rPr>
-          <w:rFonts w:ascii="Times New Roman" w:hAnsi="Times New Roman" w:eastAsia="Times New Roman" w:cs="Times New Roman"/>
-          <w:color w:val="000000"/>
+          <w:b/>
+          <w:bCs/>
+          <w:sz w:val="20"/>
+          <w:szCs w:val="20"/>
         </w:rPr>
       </w:r>
     </w:p>
@@ -35818,7 +35875,7 @@
     <customSectPr/>
   </customSectProps>
   <customShpExts>
-    <customShpInfo spid="_x005F_x005F_x005F_x005F_x005F_x005F_x005F_x005F_x005F_x005F_x005F_x005F_x005F_x005F_x005F_x005F_x005F_x005F_x005F_x005F_x005F_x005F_x005F_x005F_x005F_x005F_x005F_x005F_x005F_x005F_x005F_x005F_x005F_x005F_x005F_x005F_x005F_x005F_x005F_x005F_x005F_x005F_x005F_x005F_x005F_x005F_x005F_x005F_x005F_x005F_x005F_x005F_x005F_x005F_x005F_x005F_x005F_x005F_x005F_x005F_x005F_x005F_x005F_x005F_x005F_x005F_x005F_x005F_x005F_x005F_x005F_x005F_x005F_x005F_x005F_x005F_x005F_x005F_x005F_x005F_x005F_x005F_x005F_x005F_x005F_x005F_x005F_x005F_x005F_x005F_x005F_x005F_x005F_x005F_x005F_x005F_x005F_x005F_x005F_x005F_x005F_x005F_x005F_x005F_x005F_x005F_x005F_x005F_x005F_x005F_x005F_x005F_x005F_x005F_x005F_x005F_x005F_x005F_x005F_x005F_x005F_x005F_x005F_x005F_x005F_x005F_x005F_x005F_x005F_x005F_x005F_x005F_x005F_x005F_x005F_x005F_x005F_x005F_x005F_x005F_x005F_x005F_x005F_x005F_x005F_x005F_x005F_x005F_x005F_x005F_x005F_x005F_x005F_x005F_x005F_x005F_x005F_x005F_x005F_x005F_x005F_x005F_x005F_x005F_x005F_x005F_x005F_x005F_x005F_x005F_x005F_x005F_x005F_x005F_x005F_x005F_x005F_x005F_x005F_x005F_x005F_x005F_x005F_x005F_x005F_x005F_x005F_x005F_x005F_x005F_x005F_x005F_x005F_x005F_x005F_x005F_x005F_x005F_x005F_x005F_x005F_x005F_x005F_x005F_x005F_x005F_x005F_x005F_x005F_x005F_x005F_x005F_x005F_x005F_x005F_x005F_x005F_x005F_x005F_x005F_x005F_x005F_x005F_x005F_x005F_x005F_x005F_x005F_x005F_x005F_x005F_x005F_x005F_x005F_x005F_x005F_x005F_x005F_x005F_x005F_x005F_x005F_x005F_x005F_x005F_x005F_x005F_x005F_x005F_x005F_x005F_x005F_x005F_x005F_x005F_x0000_s1026" textRotate="1"/>
+    <customShpInfo spid="_x005F_x005F_x005F_x005F_x005F_x005F_x005F_x005F_x005F_x005F_x005F_x005F_x005F_x005F_x005F_x005F_x005F_x005F_x005F_x005F_x005F_x005F_x005F_x005F_x005F_x005F_x005F_x005F_x005F_x005F_x005F_x005F_x005F_x005F_x005F_x005F_x005F_x005F_x005F_x005F_x005F_x005F_x005F_x005F_x005F_x005F_x005F_x005F_x005F_x005F_x005F_x005F_x005F_x005F_x005F_x005F_x005F_x005F_x005F_x005F_x005F_x005F_x005F_x005F_x005F_x005F_x005F_x005F_x005F_x005F_x005F_x005F_x005F_x005F_x005F_x005F_x005F_x005F_x005F_x005F_x005F_x005F_x005F_x005F_x005F_x005F_x005F_x005F_x005F_x005F_x005F_x005F_x005F_x005F_x005F_x005F_x005F_x005F_x005F_x005F_x005F_x005F_x005F_x005F_x005F_x005F_x005F_x005F_x005F_x005F_x005F_x005F_x005F_x005F_x005F_x005F_x005F_x005F_x005F_x005F_x005F_x005F_x005F_x005F_x005F_x005F_x005F_x005F_x005F_x005F_x005F_x005F_x005F_x005F_x005F_x005F_x005F_x005F_x005F_x005F_x005F_x005F_x005F_x005F_x005F_x005F_x005F_x005F_x005F_x005F_x005F_x005F_x005F_x005F_x005F_x005F_x005F_x005F_x005F_x005F_x005F_x005F_x005F_x005F_x005F_x005F_x005F_x005F_x005F_x005F_x005F_x005F_x005F_x005F_x005F_x005F_x005F_x005F_x005F_x005F_x005F_x005F_x005F_x005F_x005F_x005F_x005F_x005F_x005F_x005F_x005F_x005F_x005F_x005F_x005F_x005F_x005F_x005F_x005F_x005F_x005F_x005F_x005F_x005F_x005F_x005F_x005F_x005F_x005F_x005F_x005F_x005F_x005F_x005F_x005F_x005F_x005F_x005F_x005F_x005F_x005F_x005F_x005F_x005F_x005F_x005F_x005F_x005F_x005F_x005F_x005F_x005F_x005F_x005F_x005F_x005F_x005F_x005F_x005F_x005F_x005F_x005F_x005F_x005F_x005F_x005F_x005F_x005F_x005F_x005F_x005F_x005F_x005F_x005F_x005F_x005F_x005F_x005F_x005F_x005F_x005F_x005F_x005F_x005F_x005F_x005F_x005F_x005F_x005F_x005F_x005F_x005F_x005F_x005F_x005F_x005F_x005F_x005F_x005F_x005F_x005F_x005F_x005F_x005F_x005F_x005F_x005F_x005F_x005F_x005F_x005F_x005F_x005F_x005F_x005F_x005F_x005F_x005F_x005F_x005F_x005F_x005F_x005F_x005F_x005F_x005F_x005F_x005F_x005F_x005F_x005F_x005F_x005F_x005F_x005F_x005F_x005F_x005F_x005F_x005F_x005F_x005F_x005F_x005F_x005F_x005F_x005F_x005F_x005F_x005F_x005F_x005F_x005F_x005F_x005F_x005F_x005F_x005F_x005F_x005F_x005F_x005F_x005F_x005F_x005F_x005F_x005F_x005F_x005F_x005F_x005F_x005F_x005F_x005F_x005F_x005F_x005F_x005F_x005F_x005F_x005F_x005F_x005F_x005F_x005F_x005F_x005F_x005F_x005F_x005F_x005F_x005F_x005F_x005F_x005F_x005F_x005F_x005F_x005F_x005F_x005F_x005F_x005F_x005F_x005F_x005F_x005F_x005F_x005F_x005F_x005F_x005F_x005F_x005F_x005F_x005F_x005F_x005F_x005F_x005F_x005F_x005F_x005F_x005F_x005F_x005F_x005F_x005F_x005F_x005F_x005F_x005F_x005F_x005F_x005F_x005F_x005F_x005F_x005F_x005F_x005F_x005F_x005F_x005F_x005F_x005F_x005F_x005F_x005F_x005F_x005F_x005F_x005F_x005F_x005F_x005F_x005F_x005F_x005F_x005F_x005F_x005F_x005F_x005F_x005F_x005F_x005F_x005F_x005F_x005F_x005F_x005F_x005F_x005F_x005F_x005F_x005F_x005F_x005F_x005F_x005F_x005F_x005F_x005F_x005F_x005F_x005F_x005F_x005F_x005F_x005F_x005F_x005F_x005F_x005F_x005F_x005F_x005F_x005F_x005F_x005F_x005F_x005F_x005F_x005F_x005F_x005F_x005F_x005F_x005F_x005F_x005F_x005F_x005F_x005F_x005F_x005F_x005F_x005F_x005F_x005F_x005F_x005F_x005F_x005F_x005F_x005F_x005F_x005F_x005F_x005F_x0000_s1026" textRotate="1"/>
   </customShpExts>
 </s:customData>
 </file>

</xml_diff>